<commit_message>
Update project conclusions and documentation
</commit_message>
<xml_diff>
--- a/Resumen_cambios_proyecto_customer_churn.docx
+++ b/Resumen_cambios_proyecto_customer_churn.docx
@@ -1414,13 +1414,7 @@
         <w:rPr>
           <w:lang w:val="es-419"/>
         </w:rPr>
-        <w:t xml:space="preserve">El </w:t>
-      </w:r>
-      <w:r>
-        <w:rPr>
-          <w:lang w:val="es-419"/>
-        </w:rPr>
-        <w:t>objetivo predeterminado es will_buy_again_6m.</w:t>
+        <w:t>El objetivo predeterminado es will_buy_again_6m.</w:t>
       </w:r>
     </w:p>
     <w:p>
@@ -2251,7 +2245,21 @@
         <w:rPr>
           <w:lang w:val="es-419"/>
         </w:rPr>
-        <w:t xml:space="preserve"> queda como fallback para ciudad, </w:t>
+        <w:t xml:space="preserve"> queda como </w:t>
+      </w:r>
+      <w:proofErr w:type="spellStart"/>
+      <w:r>
+        <w:rPr>
+          <w:lang w:val="es-419"/>
+        </w:rPr>
+        <w:t>fallback</w:t>
+      </w:r>
+      <w:proofErr w:type="spellEnd"/>
+      <w:r>
+        <w:rPr>
+          <w:lang w:val="es-419"/>
+        </w:rPr>
+        <w:t xml:space="preserve"> para ciudad, </w:t>
       </w:r>
       <w:r>
         <w:rPr>
@@ -2275,13 +2283,7 @@
         <w:rPr>
           <w:lang w:val="es-419"/>
         </w:rPr>
-        <w:t xml:space="preserve"> postal cuando no </w:t>
-      </w:r>
-      <w:r>
-        <w:rPr>
-          <w:lang w:val="es-419"/>
-        </w:rPr>
-        <w:t xml:space="preserve">existe una </w:t>
+        <w:t xml:space="preserve"> postal cuando no existe una </w:t>
       </w:r>
       <w:r>
         <w:rPr>
@@ -3182,73 +3184,196 @@
         <w:rPr>
           <w:lang w:val="es-419"/>
         </w:rPr>
+        <w:t xml:space="preserve"> nuevamente la comparación con las nuevas </w:t>
+      </w:r>
+      <w:proofErr w:type="spellStart"/>
+      <w:r>
+        <w:rPr>
+          <w:lang w:val="es-419"/>
+        </w:rPr>
+        <w:t>features</w:t>
+      </w:r>
+      <w:proofErr w:type="spellEnd"/>
+      <w:r>
+        <w:rPr>
+          <w:lang w:val="es-419"/>
+        </w:rPr>
+        <w:t xml:space="preserve"> geográficas simplificadas.</w:t>
+      </w:r>
+    </w:p>
+    <w:p>
+      <w:pPr>
+        <w:pStyle w:val="ListBullet"/>
+        <w:rPr>
+          <w:lang w:val="es-419"/>
+        </w:rPr>
+      </w:pPr>
+      <w:r>
+        <w:rPr>
+          <w:lang w:val="es-419"/>
+        </w:rPr>
+        <w:t xml:space="preserve">Para el horizonte de 90 días, </w:t>
+      </w:r>
+      <w:proofErr w:type="spellStart"/>
+      <w:r>
+        <w:rPr>
+          <w:lang w:val="es-419"/>
+        </w:rPr>
+        <w:t>Random</w:t>
+      </w:r>
+      <w:proofErr w:type="spellEnd"/>
+      <w:r>
+        <w:rPr>
+          <w:lang w:val="es-419"/>
+        </w:rPr>
+        <w:t xml:space="preserve"> Forest obtuvo F1 = 0.7119 y ROC-AUC = 0.9333.</w:t>
+      </w:r>
+    </w:p>
+    <w:p>
+      <w:pPr>
+        <w:pStyle w:val="ListBullet"/>
+        <w:rPr>
+          <w:lang w:val="es-419"/>
+        </w:rPr>
+      </w:pPr>
+      <w:r>
+        <w:rPr>
+          <w:lang w:val="es-419"/>
+        </w:rPr>
+        <w:t xml:space="preserve">Para el horizonte de 6 meses, </w:t>
+      </w:r>
+      <w:proofErr w:type="spellStart"/>
+      <w:r>
+        <w:rPr>
+          <w:lang w:val="es-419"/>
+        </w:rPr>
+        <w:t>Random</w:t>
+      </w:r>
+      <w:proofErr w:type="spellEnd"/>
+      <w:r>
+        <w:rPr>
+          <w:lang w:val="es-419"/>
+        </w:rPr>
+        <w:t xml:space="preserve"> Forest obtuvo F1 = 0.8509 y ROC-AUC = 0.9647.</w:t>
+      </w:r>
+    </w:p>
+    <w:p>
+      <w:pPr>
+        <w:pStyle w:val="ListBullet"/>
+        <w:rPr>
+          <w:lang w:val="es-419"/>
+        </w:rPr>
+      </w:pPr>
+      <w:proofErr w:type="spellStart"/>
+      <w:r>
+        <w:rPr>
+          <w:lang w:val="es-419"/>
+        </w:rPr>
+        <w:t>XGBoost</w:t>
+      </w:r>
+      <w:proofErr w:type="spellEnd"/>
+      <w:r>
+        <w:rPr>
+          <w:lang w:val="es-419"/>
+        </w:rPr>
+        <w:t xml:space="preserve"> quedó prácticamente empatado para 6 meses, con F1 = 0.8502 y ROC-AUC = 0.9650.</w:t>
+      </w:r>
+    </w:p>
+    <w:p>
+      <w:pPr>
+        <w:pStyle w:val="ListBullet"/>
+        <w:rPr>
+          <w:lang w:val="es-419"/>
+        </w:rPr>
+      </w:pPr>
+      <w:proofErr w:type="spellStart"/>
+      <w:r>
+        <w:rPr>
+          <w:lang w:val="es-419"/>
+        </w:rPr>
+        <w:t>Random</w:t>
+      </w:r>
+      <w:proofErr w:type="spellEnd"/>
+      <w:r>
+        <w:rPr>
+          <w:lang w:val="es-419"/>
+        </w:rPr>
+        <w:t xml:space="preserve"> Forest queda como modelo recomendado por obtener el mejor F1 y una baja variabilidad entre </w:t>
+      </w:r>
+      <w:proofErr w:type="spellStart"/>
+      <w:r>
+        <w:rPr>
+          <w:lang w:val="es-419"/>
+        </w:rPr>
+        <w:t>folds</w:t>
+      </w:r>
+      <w:proofErr w:type="spellEnd"/>
+      <w:r>
+        <w:rPr>
+          <w:lang w:val="es-419"/>
+        </w:rPr>
+        <w:t>.</w:t>
+      </w:r>
+    </w:p>
+    <w:p>
+      <w:pPr>
+        <w:pStyle w:val="ListBullet"/>
+      </w:pPr>
+      <w:proofErr w:type="gramStart"/>
+      <w:r>
+        <w:t>Los</w:t>
+      </w:r>
+      <w:proofErr w:type="gramEnd"/>
+      <w:r>
+        <w:t xml:space="preserve"> rankings se </w:t>
+      </w:r>
+      <w:proofErr w:type="spellStart"/>
+      <w:r>
+        <w:t>guardaron</w:t>
+      </w:r>
+      <w:proofErr w:type="spellEnd"/>
+      <w:r>
         <w:t xml:space="preserve"> </w:t>
       </w:r>
-      <w:r>
-        <w:rPr>
-          <w:lang w:val="es-419"/>
-        </w:rPr>
-        <w:t>nuevamente la comparación</w:t>
-      </w:r>
-      <w:r>
-        <w:rPr>
-          <w:lang w:val="es-419"/>
-        </w:rPr>
-        <w:t xml:space="preserve"> con las nuevas </w:t>
-      </w:r>
       <w:proofErr w:type="spellStart"/>
       <w:r>
-        <w:rPr>
-          <w:lang w:val="es-419"/>
-        </w:rPr>
-        <w:t>features</w:t>
+        <w:t>en</w:t>
       </w:r>
       <w:proofErr w:type="spellEnd"/>
       <w:r>
-        <w:rPr>
-          <w:lang w:val="es-419"/>
-        </w:rPr>
-        <w:t xml:space="preserve"> geográficas</w:t>
-      </w:r>
-      <w:r>
-        <w:rPr>
-          <w:lang w:val="es-419"/>
-        </w:rPr>
-        <w:t xml:space="preserve"> simplificadas.</w:t>
+        <w:t xml:space="preserve"> model_rankings_soon.csv y model_rankings_6m.csv.</w:t>
+      </w:r>
+    </w:p>
+    <w:p>
+      <w:pPr>
+        <w:pStyle w:val="Heading1"/>
+      </w:pPr>
+      <w:r>
+        <w:t>Estado actual</w:t>
       </w:r>
     </w:p>
     <w:p>
       <w:pPr>
         <w:pStyle w:val="ListBullet"/>
-        <w:rPr>
-          <w:lang w:val="es-419"/>
-        </w:rPr>
-      </w:pPr>
-      <w:r>
-        <w:rPr>
-          <w:lang w:val="es-419"/>
-        </w:rPr>
-        <w:t>Para el horizonte de 90 días</w:t>
-      </w:r>
-      <w:r>
-        <w:rPr>
-          <w:lang w:val="es-419"/>
-        </w:rPr>
-        <w:t xml:space="preserve">, </w:t>
+      </w:pPr>
+      <w:r>
+        <w:t xml:space="preserve">El pipeline de extraction, preprocessing, feature engineering y model selection se </w:t>
       </w:r>
       <w:proofErr w:type="spellStart"/>
       <w:r>
-        <w:rPr>
-          <w:lang w:val="es-419"/>
-        </w:rPr>
-        <w:t>Random</w:t>
+        <w:t>ejecuta</w:t>
       </w:r>
       <w:proofErr w:type="spellEnd"/>
       <w:r>
-        <w:rPr>
-          <w:lang w:val="es-419"/>
-        </w:rPr>
-        <w:t xml:space="preserve"> Forest obtuvo F1 = 0.7119 y ROC-AUC = 0.9333.</w:t>
+        <w:t xml:space="preserve"> </w:t>
+      </w:r>
+      <w:proofErr w:type="spellStart"/>
+      <w:r>
+        <w:t>correctamente</w:t>
+      </w:r>
+      <w:proofErr w:type="spellEnd"/>
+      <w:r>
+        <w:t>.</w:t>
       </w:r>
     </w:p>
     <w:p>
@@ -3262,21 +3387,21 @@
         <w:rPr>
           <w:lang w:val="es-419"/>
         </w:rPr>
-        <w:t xml:space="preserve">Para el horizonte de 6 meses, </w:t>
+        <w:t xml:space="preserve">Los resultados dejaron de ser artificialmente perfectos y ahora son consistentes con una evaluación sin target </w:t>
       </w:r>
       <w:proofErr w:type="spellStart"/>
       <w:r>
         <w:rPr>
           <w:lang w:val="es-419"/>
         </w:rPr>
-        <w:t>Random</w:t>
+        <w:t>leakage</w:t>
       </w:r>
       <w:proofErr w:type="spellEnd"/>
       <w:r>
         <w:rPr>
           <w:lang w:val="es-419"/>
         </w:rPr>
-        <w:t xml:space="preserve"> Forest obtuvo F1 = 0.8509 y ROC-AUC = 0.9647.</w:t>
+        <w:t>.</w:t>
       </w:r>
     </w:p>
     <w:p>
@@ -3286,185 +3411,11 @@
           <w:lang w:val="es-419"/>
         </w:rPr>
       </w:pPr>
-      <w:proofErr w:type="spellStart"/>
-      <w:r>
-        <w:rPr>
-          <w:lang w:val="es-419"/>
-        </w:rPr>
-        <w:t>XGBoost</w:t>
-      </w:r>
-      <w:proofErr w:type="spellEnd"/>
-      <w:r>
-        <w:rPr>
-          <w:lang w:val="es-419"/>
-        </w:rPr>
-        <w:t xml:space="preserve"> quedó</w:t>
-      </w:r>
-      <w:r>
-        <w:rPr>
-          <w:lang w:val="es-419"/>
-        </w:rPr>
-        <w:t xml:space="preserve"> prácticamente</w:t>
-      </w:r>
-      <w:r>
-        <w:rPr>
-          <w:lang w:val="es-419"/>
-        </w:rPr>
-        <w:t xml:space="preserve"> empatado para 6 meses, con F1 = 0.8502 y ROC-AUC = 0.9650.</w:t>
-      </w:r>
-    </w:p>
-    <w:p>
-      <w:pPr>
-        <w:pStyle w:val="ListBullet"/>
-        <w:rPr>
-          <w:lang w:val="es-419"/>
-        </w:rPr>
-      </w:pPr>
-      <w:proofErr w:type="spellStart"/>
-      <w:r>
-        <w:rPr>
-          <w:lang w:val="es-419"/>
-        </w:rPr>
-        <w:t>Random</w:t>
-      </w:r>
-      <w:proofErr w:type="spellEnd"/>
-      <w:r>
-        <w:rPr>
-          <w:lang w:val="es-419"/>
-        </w:rPr>
-        <w:t xml:space="preserve"> Forest queda como modelo recomendado por obtener el mejor F1 y una baja variabilidad entre </w:t>
-      </w:r>
-      <w:proofErr w:type="spellStart"/>
-      <w:r>
-        <w:rPr>
-          <w:lang w:val="es-419"/>
-        </w:rPr>
-        <w:t>folds</w:t>
-      </w:r>
-      <w:proofErr w:type="spellEnd"/>
-      <w:r>
-        <w:rPr>
-          <w:lang w:val="es-419"/>
-        </w:rPr>
-        <w:t>.</w:t>
-      </w:r>
-    </w:p>
-    <w:p>
-      <w:pPr>
-        <w:pStyle w:val="ListBullet"/>
-      </w:pPr>
-      <w:proofErr w:type="gramStart"/>
-      <w:r>
-        <w:t>Los</w:t>
-      </w:r>
-      <w:proofErr w:type="gramEnd"/>
-      <w:r>
-        <w:t xml:space="preserve"> rankings se </w:t>
-      </w:r>
-      <w:proofErr w:type="spellStart"/>
-      <w:r>
-        <w:t>guardaron</w:t>
-      </w:r>
-      <w:proofErr w:type="spellEnd"/>
-      <w:r>
-        <w:t xml:space="preserve"> </w:t>
-      </w:r>
-      <w:proofErr w:type="spellStart"/>
-      <w:r>
-        <w:t>en</w:t>
-      </w:r>
-      <w:proofErr w:type="spellEnd"/>
-      <w:r>
-        <w:t xml:space="preserve"> model_rankings_soon.csv y model_rankings_6m.csv.</w:t>
-      </w:r>
-    </w:p>
-    <w:p>
-      <w:pPr>
-        <w:pStyle w:val="Heading1"/>
-      </w:pPr>
-      <w:r>
-        <w:t>Estado actual</w:t>
-      </w:r>
-    </w:p>
-    <w:p>
-      <w:pPr>
-        <w:pStyle w:val="ListBullet"/>
-      </w:pPr>
-      <w:r>
-        <w:t>El pipeline de extraction</w:t>
-      </w:r>
-      <w:r>
-        <w:t xml:space="preserve">, preprocessing, feature engineering y model selection se </w:t>
-      </w:r>
-      <w:proofErr w:type="spellStart"/>
-      <w:r>
-        <w:t>ejecuta</w:t>
-      </w:r>
-      <w:proofErr w:type="spellEnd"/>
-      <w:r>
-        <w:t xml:space="preserve"> </w:t>
-      </w:r>
-      <w:proofErr w:type="spellStart"/>
-      <w:r>
-        <w:t>correctamente</w:t>
-      </w:r>
-      <w:proofErr w:type="spellEnd"/>
-      <w:r>
-        <w:t>.</w:t>
-      </w:r>
-    </w:p>
-    <w:p>
-      <w:pPr>
-        <w:pStyle w:val="ListBullet"/>
-        <w:rPr>
-          <w:lang w:val="es-419"/>
-        </w:rPr>
-      </w:pPr>
-      <w:r>
-        <w:rPr>
-          <w:lang w:val="es-419"/>
-        </w:rPr>
-        <w:t>Los resultados dejaron de ser artificialmente perfectos y ahora son consistentes con una evaluación</w:t>
-      </w:r>
-      <w:r>
-        <w:rPr>
-          <w:lang w:val="es-419"/>
-        </w:rPr>
-        <w:t xml:space="preserve"> sin target </w:t>
-      </w:r>
-      <w:proofErr w:type="spellStart"/>
-      <w:r>
-        <w:rPr>
-          <w:lang w:val="es-419"/>
-        </w:rPr>
-        <w:t>leakage</w:t>
-      </w:r>
-      <w:proofErr w:type="spellEnd"/>
-      <w:r>
-        <w:rPr>
-          <w:lang w:val="es-419"/>
-        </w:rPr>
-        <w:t>.</w:t>
-      </w:r>
-    </w:p>
-    <w:p>
-      <w:pPr>
-        <w:pStyle w:val="ListBullet"/>
-        <w:rPr>
-          <w:lang w:val="es-419"/>
-        </w:rPr>
-      </w:pPr>
-      <w:r>
-        <w:rPr>
-          <w:lang w:val="es-419"/>
-        </w:rPr>
-        <w:t>El siguiente paso es entrenar el modelo seleccionado mediante 06_training.py y luego evaluar su desempeño</w:t>
-      </w:r>
-      <w:r>
-        <w:rPr>
-          <w:lang w:val="es-419"/>
-        </w:rPr>
-        <w:t xml:space="preserve"> final.</w:t>
+      <w:r>
+        <w:rPr>
+          <w:lang w:val="es-419"/>
+        </w:rPr>
+        <w:t>El siguiente paso es entrenar el modelo seleccionado mediante 06_training.py y luego evaluar su desempeño final.</w:t>
       </w:r>
     </w:p>
     <w:p>
@@ -3476,6 +3427,7 @@
           <w:color w:val="365F91" w:themeColor="accent1" w:themeShade="BF"/>
           <w:sz w:val="28"/>
           <w:szCs w:val="28"/>
+          <w:lang w:val="es-419"/>
         </w:rPr>
       </w:pPr>
       <w:r>
@@ -3486,6 +3438,7 @@
           <w:color w:val="365F91" w:themeColor="accent1" w:themeShade="BF"/>
           <w:sz w:val="28"/>
           <w:szCs w:val="28"/>
+          <w:lang w:val="es-419"/>
         </w:rPr>
         <w:t xml:space="preserve">Fuente </w:t>
       </w:r>
@@ -3497,6 +3450,7 @@
           <w:color w:val="365F91" w:themeColor="accent1" w:themeShade="BF"/>
           <w:sz w:val="28"/>
           <w:szCs w:val="28"/>
+          <w:lang w:val="es-419"/>
         </w:rPr>
         <w:t>geográfica</w:t>
       </w:r>
@@ -3508,6 +3462,7 @@
           <w:color w:val="365F91" w:themeColor="accent1" w:themeShade="BF"/>
           <w:sz w:val="28"/>
           <w:szCs w:val="28"/>
+          <w:lang w:val="es-419"/>
         </w:rPr>
         <w:t xml:space="preserve"> externa y enriquecimiento de clientes</w:t>
       </w:r>
@@ -4428,13 +4383,7 @@
         <w:rPr>
           <w:lang w:val="es-419"/>
         </w:rPr>
-        <w:t xml:space="preserve"> a nivel de coordenadas, pero combina </w:t>
-      </w:r>
-      <w:r>
-        <w:rPr>
-          <w:lang w:val="es-419"/>
-        </w:rPr>
-        <w:t xml:space="preserve">nombre </w:t>
+        <w:t xml:space="preserve"> a nivel de coordenadas, pero combina nombre </w:t>
       </w:r>
       <w:r>
         <w:rPr>
@@ -4750,13 +4699,27 @@
         <w:rPr>
           <w:lang w:val="es-419"/>
         </w:rPr>
-        <w:t xml:space="preserve"> se utilizaron como fallback cuando </w:t>
+        <w:t xml:space="preserve"> se utilizaron como </w:t>
       </w:r>
       <w:proofErr w:type="spellStart"/>
       <w:r>
         <w:rPr>
           <w:lang w:val="es-419"/>
         </w:rPr>
+        <w:t>fallback</w:t>
+      </w:r>
+      <w:proofErr w:type="spellEnd"/>
+      <w:r>
+        <w:rPr>
+          <w:lang w:val="es-419"/>
+        </w:rPr>
+        <w:t xml:space="preserve"> cuando </w:t>
+      </w:r>
+      <w:proofErr w:type="spellStart"/>
+      <w:r>
+        <w:rPr>
+          <w:lang w:val="es-419"/>
+        </w:rPr>
         <w:t>AdventureWorks</w:t>
       </w:r>
       <w:proofErr w:type="spellEnd"/>
@@ -5170,24 +5133,66 @@
       </w:r>
     </w:p>
     <w:p>
-      <w:r>
+      <w:pPr>
+        <w:rPr>
+          <w:lang w:val="es-419"/>
+        </w:rPr>
+      </w:pPr>
+      <w:r>
+        <w:rPr>
+          <w:lang w:val="es-419"/>
+        </w:rPr>
         <w:br w:type="page"/>
       </w:r>
     </w:p>
     <w:p>
       <w:pPr>
         <w:pStyle w:val="Title"/>
-      </w:pPr>
-      <w:r>
+        <w:rPr>
+          <w:lang w:val="es-419"/>
+        </w:rPr>
+      </w:pPr>
+      <w:r>
+        <w:rPr>
+          <w:lang w:val="es-419"/>
+        </w:rPr>
+        <w:lastRenderedPageBreak/>
         <w:t>Ajustes recientes de EDA y orden del pipeline</w:t>
       </w:r>
     </w:p>
     <w:p>
+      <w:pPr>
+        <w:rPr>
+          <w:lang w:val="es-419"/>
+        </w:rPr>
+      </w:pPr>
       <w:r>
         <w:rPr>
           <w:i/>
-        </w:rPr>
-        <w:t>Actualizaci?n correspondiente a los ?ltimos cambios realizados.</w:t>
+          <w:lang w:val="es-419"/>
+        </w:rPr>
+        <w:t>Actualización</w:t>
+      </w:r>
+      <w:r>
+        <w:rPr>
+          <w:i/>
+          <w:lang w:val="es-419"/>
+        </w:rPr>
+        <w:t xml:space="preserve"> correspondiente a los </w:t>
+      </w:r>
+      <w:r>
+        <w:rPr>
+          <w:i/>
+          <w:lang w:val="es-419"/>
+        </w:rPr>
+        <w:t>últimos</w:t>
+      </w:r>
+      <w:r>
+        <w:rPr>
+          <w:i/>
+          <w:lang w:val="es-419"/>
+        </w:rPr>
+        <w:t xml:space="preserve"> cambios realizados.</w:t>
       </w:r>
     </w:p>
     <w:p>
@@ -5201,57 +5206,397 @@
     <w:p>
       <w:pPr>
         <w:pStyle w:val="ListBullet"/>
-      </w:pPr>
-      <w:r>
-        <w:t>La EDA general contin?a utilizando raw_customer_features.csv para revisar estructura, cohortes, targets y calidad general de los datos.</w:t>
+        <w:rPr>
+          <w:lang w:val="es-419"/>
+        </w:rPr>
+      </w:pPr>
+      <w:r>
+        <w:rPr>
+          <w:lang w:val="es-419"/>
+        </w:rPr>
+        <w:t xml:space="preserve">La EDA general </w:t>
+      </w:r>
+      <w:r>
+        <w:rPr>
+          <w:lang w:val="es-419"/>
+        </w:rPr>
+        <w:t>continúa</w:t>
+      </w:r>
+      <w:r>
+        <w:rPr>
+          <w:lang w:val="es-419"/>
+        </w:rPr>
+        <w:t xml:space="preserve"> utilizando raw_customer_features.csv para revisar </w:t>
+      </w:r>
+      <w:r>
+        <w:rPr>
+          <w:lang w:val="es-419"/>
+        </w:rPr>
+        <w:t>estructura, cohortes, targets y calidad general de los datos.</w:t>
       </w:r>
     </w:p>
     <w:p>
       <w:pPr>
         <w:pStyle w:val="ListBullet"/>
-      </w:pPr>
-      <w:r>
-        <w:t>La EDA espec?fica del modelo ahora utiliza engineered_features.csv para analizar las variables que realmente ingresan al modelado.</w:t>
+        <w:rPr>
+          <w:lang w:val="es-419"/>
+        </w:rPr>
+      </w:pPr>
+      <w:r>
+        <w:rPr>
+          <w:lang w:val="es-419"/>
+        </w:rPr>
+        <w:t xml:space="preserve">La EDA </w:t>
+      </w:r>
+      <w:r>
+        <w:rPr>
+          <w:lang w:val="es-419"/>
+        </w:rPr>
+        <w:t>específica</w:t>
+      </w:r>
+      <w:r>
+        <w:rPr>
+          <w:lang w:val="es-419"/>
+        </w:rPr>
+        <w:t xml:space="preserve"> del modelo ahora utiliza engineered_features.csv para analizar las variables que realmente ingresan al modelado.</w:t>
       </w:r>
     </w:p>
     <w:p>
       <w:pPr>
         <w:pStyle w:val="ListBullet"/>
-      </w:pPr>
-      <w:r>
-        <w:t>La matriz de correlaci?n incluye distance_to_major_city_km, junto con city_class_major, has_geographic_match y las variables geogr?ficas num?ricas.</w:t>
+        <w:rPr>
+          <w:lang w:val="es-419"/>
+        </w:rPr>
+      </w:pPr>
+      <w:r>
+        <w:rPr>
+          <w:lang w:val="es-419"/>
+        </w:rPr>
+        <w:t xml:space="preserve">La matriz de </w:t>
+      </w:r>
+      <w:r>
+        <w:rPr>
+          <w:lang w:val="es-419"/>
+        </w:rPr>
+        <w:t>correlación</w:t>
+      </w:r>
+      <w:r>
+        <w:rPr>
+          <w:lang w:val="es-419"/>
+        </w:rPr>
+        <w:t xml:space="preserve"> incluye </w:t>
+      </w:r>
+      <w:proofErr w:type="spellStart"/>
+      <w:r>
+        <w:rPr>
+          <w:lang w:val="es-419"/>
+        </w:rPr>
+        <w:t>distance_to_major_city_km</w:t>
+      </w:r>
+      <w:proofErr w:type="spellEnd"/>
+      <w:r>
+        <w:rPr>
+          <w:lang w:val="es-419"/>
+        </w:rPr>
+        <w:t xml:space="preserve">, junto con </w:t>
+      </w:r>
+      <w:proofErr w:type="spellStart"/>
+      <w:r>
+        <w:rPr>
+          <w:lang w:val="es-419"/>
+        </w:rPr>
+        <w:t>city_class_major</w:t>
+      </w:r>
+      <w:proofErr w:type="spellEnd"/>
+      <w:r>
+        <w:rPr>
+          <w:lang w:val="es-419"/>
+        </w:rPr>
+        <w:t xml:space="preserve">, </w:t>
+      </w:r>
+      <w:proofErr w:type="spellStart"/>
+      <w:r>
+        <w:rPr>
+          <w:lang w:val="es-419"/>
+        </w:rPr>
+        <w:t>has_geographic_match</w:t>
+      </w:r>
+      <w:proofErr w:type="spellEnd"/>
+      <w:r>
+        <w:rPr>
+          <w:lang w:val="es-419"/>
+        </w:rPr>
+        <w:t xml:space="preserve"> y las variables </w:t>
+      </w:r>
+      <w:r>
+        <w:rPr>
+          <w:lang w:val="es-419"/>
+        </w:rPr>
+        <w:t>geográficas</w:t>
+      </w:r>
+      <w:r>
+        <w:rPr>
+          <w:lang w:val="es-419"/>
+        </w:rPr>
+        <w:t xml:space="preserve"> </w:t>
+      </w:r>
+      <w:r>
+        <w:rPr>
+          <w:lang w:val="es-419"/>
+        </w:rPr>
+        <w:t>numéricas</w:t>
+      </w:r>
+      <w:r>
+        <w:rPr>
+          <w:lang w:val="es-419"/>
+        </w:rPr>
+        <w:t>.</w:t>
       </w:r>
     </w:p>
     <w:p>
       <w:pPr>
         <w:pStyle w:val="ListBullet"/>
-      </w:pPr>
-      <w:r>
-        <w:t>Se agreg? el an?lisis de tasas de compra por pa?s y por clasificaci?n Major City / Small City.</w:t>
+        <w:rPr>
+          <w:lang w:val="es-419"/>
+        </w:rPr>
+      </w:pPr>
+      <w:r>
+        <w:rPr>
+          <w:lang w:val="es-419"/>
+        </w:rPr>
+        <w:t xml:space="preserve">Se </w:t>
+      </w:r>
+      <w:r>
+        <w:rPr>
+          <w:lang w:val="es-419"/>
+        </w:rPr>
+        <w:t>agregó</w:t>
+      </w:r>
+      <w:r>
+        <w:rPr>
+          <w:lang w:val="es-419"/>
+        </w:rPr>
+        <w:t xml:space="preserve"> el </w:t>
+      </w:r>
+      <w:r>
+        <w:rPr>
+          <w:lang w:val="es-419"/>
+        </w:rPr>
+        <w:t>análisis</w:t>
+      </w:r>
+      <w:r>
+        <w:rPr>
+          <w:lang w:val="es-419"/>
+        </w:rPr>
+        <w:t xml:space="preserve"> de tasas de compra por </w:t>
+      </w:r>
+      <w:r>
+        <w:rPr>
+          <w:lang w:val="es-419"/>
+        </w:rPr>
+        <w:t>país</w:t>
+      </w:r>
+      <w:r>
+        <w:rPr>
+          <w:lang w:val="es-419"/>
+        </w:rPr>
+        <w:t xml:space="preserve"> y por </w:t>
+      </w:r>
+      <w:r>
+        <w:rPr>
+          <w:lang w:val="es-419"/>
+        </w:rPr>
+        <w:t>clasificación</w:t>
+      </w:r>
+      <w:r>
+        <w:rPr>
+          <w:lang w:val="es-419"/>
+        </w:rPr>
+        <w:t xml:space="preserve"> </w:t>
+      </w:r>
+      <w:proofErr w:type="spellStart"/>
+      <w:r>
+        <w:rPr>
+          <w:lang w:val="es-419"/>
+        </w:rPr>
+        <w:t>Major</w:t>
+      </w:r>
+      <w:proofErr w:type="spellEnd"/>
+      <w:r>
+        <w:rPr>
+          <w:lang w:val="es-419"/>
+        </w:rPr>
+        <w:t xml:space="preserve"> City / Small City.</w:t>
       </w:r>
     </w:p>
     <w:p>
       <w:pPr>
         <w:pStyle w:val="ListBullet"/>
-      </w:pPr>
-      <w:r>
-        <w:t>Se excluy? el an?lisis de cientos de ciudades individuales para evitar una interpretaci?n geogr?fica excesivamente fragmentada.</w:t>
+        <w:rPr>
+          <w:lang w:val="es-419"/>
+        </w:rPr>
+      </w:pPr>
+      <w:r>
+        <w:rPr>
+          <w:lang w:val="es-419"/>
+        </w:rPr>
+        <w:t xml:space="preserve">Se </w:t>
+      </w:r>
+      <w:r>
+        <w:rPr>
+          <w:lang w:val="es-419"/>
+        </w:rPr>
+        <w:t>excluye</w:t>
+      </w:r>
+      <w:r>
+        <w:rPr>
+          <w:lang w:val="es-419"/>
+        </w:rPr>
+        <w:t xml:space="preserve"> el </w:t>
+      </w:r>
+      <w:r>
+        <w:rPr>
+          <w:lang w:val="es-419"/>
+        </w:rPr>
+        <w:t>análisis</w:t>
+      </w:r>
+      <w:r>
+        <w:rPr>
+          <w:lang w:val="es-419"/>
+        </w:rPr>
+        <w:t xml:space="preserve"> de cientos de ciudades individuales para evitar una </w:t>
+      </w:r>
+      <w:r>
+        <w:rPr>
+          <w:lang w:val="es-419"/>
+        </w:rPr>
+        <w:t>interpretación</w:t>
+      </w:r>
+      <w:r>
+        <w:rPr>
+          <w:lang w:val="es-419"/>
+        </w:rPr>
+        <w:t xml:space="preserve"> </w:t>
+      </w:r>
+      <w:r>
+        <w:rPr>
+          <w:lang w:val="es-419"/>
+        </w:rPr>
+        <w:t>geográfica</w:t>
+      </w:r>
+      <w:r>
+        <w:rPr>
+          <w:lang w:val="es-419"/>
+        </w:rPr>
+        <w:t xml:space="preserve"> excesivamente fragmentada.</w:t>
       </w:r>
     </w:p>
     <w:p>
       <w:pPr>
         <w:pStyle w:val="ListBullet"/>
-      </w:pPr>
-      <w:r>
-        <w:t>La EDA se mantiene separada para los horizontes de 90 d?as y seis meses.</w:t>
+        <w:rPr>
+          <w:lang w:val="es-419"/>
+        </w:rPr>
+      </w:pPr>
+      <w:r>
+        <w:rPr>
+          <w:lang w:val="es-419"/>
+        </w:rPr>
+        <w:t xml:space="preserve">La EDA se mantiene separada para los horizontes de 90 </w:t>
+      </w:r>
+      <w:proofErr w:type="spellStart"/>
+      <w:proofErr w:type="gramStart"/>
+      <w:r>
+        <w:rPr>
+          <w:lang w:val="es-419"/>
+        </w:rPr>
+        <w:t>d?as</w:t>
+      </w:r>
+      <w:proofErr w:type="spellEnd"/>
+      <w:proofErr w:type="gramEnd"/>
+      <w:r>
+        <w:rPr>
+          <w:lang w:val="es-419"/>
+        </w:rPr>
+        <w:t xml:space="preserve"> y seis meses.</w:t>
       </w:r>
     </w:p>
     <w:p>
       <w:pPr>
         <w:pStyle w:val="ListBullet"/>
-      </w:pPr>
-      <w:r>
-        <w:t>Se ajust? el resumen de categor?as para que sea compatible con las variables categ?ricas transformadas mediante one-hot encoding.</w:t>
+        <w:rPr>
+          <w:lang w:val="es-419"/>
+        </w:rPr>
+      </w:pPr>
+      <w:r>
+        <w:rPr>
+          <w:lang w:val="es-419"/>
+        </w:rPr>
+        <w:t xml:space="preserve">Se </w:t>
+      </w:r>
+      <w:r>
+        <w:rPr>
+          <w:lang w:val="es-419"/>
+        </w:rPr>
+        <w:t>ajusta</w:t>
+      </w:r>
+      <w:r>
+        <w:rPr>
+          <w:lang w:val="es-419"/>
+        </w:rPr>
+        <w:t xml:space="preserve"> el resumen de </w:t>
+      </w:r>
+      <w:r>
+        <w:rPr>
+          <w:lang w:val="es-419"/>
+        </w:rPr>
+        <w:t>categorías</w:t>
+      </w:r>
+      <w:r>
+        <w:rPr>
+          <w:lang w:val="es-419"/>
+        </w:rPr>
+        <w:t xml:space="preserve"> para que sea compatible con las variables </w:t>
+      </w:r>
+      <w:r>
+        <w:rPr>
+          <w:lang w:val="es-419"/>
+        </w:rPr>
+        <w:t>categóricas</w:t>
+      </w:r>
+      <w:r>
+        <w:rPr>
+          <w:lang w:val="es-419"/>
+        </w:rPr>
+        <w:t xml:space="preserve"> transformadas mediante </w:t>
+      </w:r>
+      <w:proofErr w:type="spellStart"/>
+      <w:r>
+        <w:rPr>
+          <w:lang w:val="es-419"/>
+        </w:rPr>
+        <w:t>one-hot</w:t>
+      </w:r>
+      <w:proofErr w:type="spellEnd"/>
+      <w:r>
+        <w:rPr>
+          <w:lang w:val="es-419"/>
+        </w:rPr>
+        <w:t xml:space="preserve"> </w:t>
+      </w:r>
+      <w:proofErr w:type="spellStart"/>
+      <w:r>
+        <w:rPr>
+          <w:lang w:val="es-419"/>
+        </w:rPr>
+        <w:t>encoding</w:t>
+      </w:r>
+      <w:proofErr w:type="spellEnd"/>
+      <w:r>
+        <w:rPr>
+          <w:lang w:val="es-419"/>
+        </w:rPr>
+        <w:t>.</w:t>
       </w:r>
     </w:p>
     <w:p>
@@ -5259,23 +5604,136 @@
         <w:pStyle w:val="Heading1"/>
       </w:pPr>
       <w:r>
-        <w:t>Orden actualizado de ejecuci?n</w:t>
+        <w:t xml:space="preserve">Orden </w:t>
+      </w:r>
+      <w:proofErr w:type="spellStart"/>
+      <w:r>
+        <w:t>actualizado</w:t>
+      </w:r>
+      <w:proofErr w:type="spellEnd"/>
+      <w:r>
+        <w:t xml:space="preserve"> de </w:t>
+      </w:r>
+      <w:r>
+        <w:t>execution</w:t>
       </w:r>
     </w:p>
     <w:p>
       <w:pPr>
         <w:pStyle w:val="ListBullet"/>
-      </w:pPr>
-      <w:r>
-        <w:t>La EDA inicial puede ejecutarse sobre el archivo raw despu?s de la extracci?n.</w:t>
+        <w:rPr>
+          <w:lang w:val="es-419"/>
+        </w:rPr>
+      </w:pPr>
+      <w:r>
+        <w:rPr>
+          <w:lang w:val="es-419"/>
+        </w:rPr>
+        <w:t xml:space="preserve">La EDA inicial puede ejecutarse sobre el archivo raw </w:t>
+      </w:r>
+      <w:r>
+        <w:rPr>
+          <w:lang w:val="es-419"/>
+        </w:rPr>
+        <w:t>después</w:t>
+      </w:r>
+      <w:r>
+        <w:rPr>
+          <w:lang w:val="es-419"/>
+        </w:rPr>
+        <w:t xml:space="preserve"> de la </w:t>
+      </w:r>
+      <w:r>
+        <w:rPr>
+          <w:lang w:val="es-419"/>
+        </w:rPr>
+        <w:t>extracción</w:t>
+      </w:r>
+      <w:r>
+        <w:rPr>
+          <w:lang w:val="es-419"/>
+        </w:rPr>
+        <w:t>.</w:t>
       </w:r>
     </w:p>
     <w:p>
       <w:pPr>
         <w:pStyle w:val="ListBullet"/>
-      </w:pPr>
-      <w:r>
-        <w:t>El an?lisis de las variables derivadas debe ejecutarse despu?s de feature engineering, porque distance_to_major_city_km no existe antes de ese paso.</w:t>
+        <w:rPr>
+          <w:lang w:val="es-419"/>
+        </w:rPr>
+      </w:pPr>
+      <w:r>
+        <w:rPr>
+          <w:lang w:val="es-419"/>
+        </w:rPr>
+        <w:t xml:space="preserve">El </w:t>
+      </w:r>
+      <w:r>
+        <w:rPr>
+          <w:lang w:val="es-419"/>
+        </w:rPr>
+        <w:t>análisis</w:t>
+      </w:r>
+      <w:r>
+        <w:rPr>
+          <w:lang w:val="es-419"/>
+        </w:rPr>
+        <w:t xml:space="preserve"> de las variables derivadas debe ejecutarse </w:t>
+      </w:r>
+      <w:r>
+        <w:rPr>
+          <w:lang w:val="es-419"/>
+        </w:rPr>
+        <w:t>después</w:t>
+      </w:r>
+      <w:r>
+        <w:rPr>
+          <w:lang w:val="es-419"/>
+        </w:rPr>
+        <w:t xml:space="preserve"> de </w:t>
+      </w:r>
+      <w:proofErr w:type="spellStart"/>
+      <w:r>
+        <w:rPr>
+          <w:lang w:val="es-419"/>
+        </w:rPr>
+        <w:t>feature</w:t>
+      </w:r>
+      <w:proofErr w:type="spellEnd"/>
+      <w:r>
+        <w:rPr>
+          <w:lang w:val="es-419"/>
+        </w:rPr>
+        <w:t xml:space="preserve"> </w:t>
+      </w:r>
+      <w:proofErr w:type="spellStart"/>
+      <w:r>
+        <w:rPr>
+          <w:lang w:val="es-419"/>
+        </w:rPr>
+        <w:t>engineering</w:t>
+      </w:r>
+      <w:proofErr w:type="spellEnd"/>
+      <w:r>
+        <w:rPr>
+          <w:lang w:val="es-419"/>
+        </w:rPr>
+        <w:t xml:space="preserve">, porque </w:t>
+      </w:r>
+      <w:proofErr w:type="spellStart"/>
+      <w:r>
+        <w:rPr>
+          <w:lang w:val="es-419"/>
+        </w:rPr>
+        <w:t>distance_to_major_city_km</w:t>
+      </w:r>
+      <w:proofErr w:type="spellEnd"/>
+      <w:r>
+        <w:rPr>
+          <w:lang w:val="es-419"/>
+        </w:rPr>
+        <w:t xml:space="preserve"> no existe antes de ese paso.</w:t>
       </w:r>
     </w:p>
     <w:p>
@@ -5283,47 +5741,1171 @@
         <w:pStyle w:val="ListBullet"/>
       </w:pPr>
       <w:r>
-        <w:t>El orden recomendado es: 01_data_extraction.py -&gt; 03_preprocessing.py -&gt; 04_feature_engineering.py -&gt; 02_eda.py -&gt; 05_model_selection.py -&gt; 06_training.py.</w:t>
+        <w:t xml:space="preserve">El </w:t>
+      </w:r>
+      <w:proofErr w:type="spellStart"/>
+      <w:r>
+        <w:t>orden</w:t>
+      </w:r>
+      <w:proofErr w:type="spellEnd"/>
+      <w:r>
+        <w:t xml:space="preserve"> </w:t>
+      </w:r>
+      <w:proofErr w:type="spellStart"/>
+      <w:r>
+        <w:t>recomendado</w:t>
+      </w:r>
+      <w:proofErr w:type="spellEnd"/>
+      <w:r>
+        <w:t xml:space="preserve"> es: 01_data_extraction.py -&gt; 03_preprocessing.py -&gt; 04_feature_engineering.py -&gt; 02_eda.py -&gt; 05_model_selection.py -&gt; 06_training.py.</w:t>
       </w:r>
     </w:p>
     <w:p>
       <w:pPr>
         <w:pStyle w:val="ListBullet"/>
-      </w:pPr>
-      <w:r>
-        <w:t>La EDA de features no modifica los datos utilizados por el modelo; solamente analiza y visualiza informaci?n ya preparada.</w:t>
+        <w:rPr>
+          <w:lang w:val="es-419"/>
+        </w:rPr>
+      </w:pPr>
+      <w:r>
+        <w:rPr>
+          <w:lang w:val="es-419"/>
+        </w:rPr>
+        <w:t xml:space="preserve">La EDA de </w:t>
+      </w:r>
+      <w:proofErr w:type="spellStart"/>
+      <w:r>
+        <w:rPr>
+          <w:lang w:val="es-419"/>
+        </w:rPr>
+        <w:t>features</w:t>
+      </w:r>
+      <w:proofErr w:type="spellEnd"/>
+      <w:r>
+        <w:rPr>
+          <w:lang w:val="es-419"/>
+        </w:rPr>
+        <w:t xml:space="preserve"> no modifica los datos utilizados por el modelo; solamente analiza y visualiza información</w:t>
+      </w:r>
+      <w:r>
+        <w:rPr>
+          <w:lang w:val="es-419"/>
+        </w:rPr>
+        <w:t xml:space="preserve"> ya preparada.</w:t>
       </w:r>
     </w:p>
     <w:p>
       <w:pPr>
         <w:pStyle w:val="Heading1"/>
       </w:pPr>
+      <w:proofErr w:type="spellStart"/>
+      <w:proofErr w:type="gramStart"/>
       <w:r>
         <w:t>Validaci?n</w:t>
       </w:r>
+      <w:proofErr w:type="spellEnd"/>
+      <w:proofErr w:type="gramEnd"/>
     </w:p>
     <w:p>
       <w:pPr>
         <w:pStyle w:val="ListBullet"/>
-      </w:pPr>
-      <w:r>
-        <w:t>La EDA se ejecut? correctamente despu?s de regenerar las features.</w:t>
+        <w:rPr>
+          <w:lang w:val="es-419"/>
+        </w:rPr>
+      </w:pPr>
+      <w:r>
+        <w:rPr>
+          <w:lang w:val="es-419"/>
+        </w:rPr>
+        <w:t>La EDA se ejecutó</w:t>
+      </w:r>
+      <w:r>
+        <w:rPr>
+          <w:lang w:val="es-419"/>
+        </w:rPr>
+        <w:t xml:space="preserve"> correctamente después</w:t>
+      </w:r>
+      <w:r>
+        <w:rPr>
+          <w:lang w:val="es-419"/>
+        </w:rPr>
+        <w:t xml:space="preserve"> de regenerar las </w:t>
+      </w:r>
+      <w:proofErr w:type="spellStart"/>
+      <w:r>
+        <w:rPr>
+          <w:lang w:val="es-419"/>
+        </w:rPr>
+        <w:t>features</w:t>
+      </w:r>
+      <w:proofErr w:type="spellEnd"/>
+      <w:r>
+        <w:rPr>
+          <w:lang w:val="es-419"/>
+        </w:rPr>
+        <w:t>.</w:t>
       </w:r>
     </w:p>
     <w:p>
       <w:pPr>
         <w:pStyle w:val="ListBullet"/>
-      </w:pPr>
-      <w:r>
-        <w:t>La correlaci?n de distance_to_major_city_km fue 0.046 para el horizonte de 90 d?as y 0.078 para el horizonte de seis meses.</w:t>
+        <w:rPr>
+          <w:lang w:val="es-419"/>
+        </w:rPr>
+      </w:pPr>
+      <w:r>
+        <w:rPr>
+          <w:lang w:val="es-419"/>
+        </w:rPr>
+        <w:t>La correlación</w:t>
+      </w:r>
+      <w:r>
+        <w:rPr>
+          <w:lang w:val="es-419"/>
+        </w:rPr>
+        <w:t xml:space="preserve"> de </w:t>
+      </w:r>
+      <w:proofErr w:type="spellStart"/>
+      <w:r>
+        <w:rPr>
+          <w:lang w:val="es-419"/>
+        </w:rPr>
+        <w:t>distance_to_major_city_km</w:t>
+      </w:r>
+      <w:proofErr w:type="spellEnd"/>
+      <w:r>
+        <w:rPr>
+          <w:lang w:val="es-419"/>
+        </w:rPr>
+        <w:t xml:space="preserve"> fue 0.046 para el horizonte de 90 das</w:t>
+      </w:r>
+      <w:r>
+        <w:rPr>
+          <w:lang w:val="es-419"/>
+        </w:rPr>
+        <w:t xml:space="preserve"> y 0.078 para el horizonte de seis meses.</w:t>
       </w:r>
     </w:p>
     <w:p>
       <w:pPr>
         <w:pStyle w:val="ListBullet"/>
-      </w:pPr>
-      <w:r>
-        <w:t>Se generaron nuevamente las seis visualizaciones correspondientes a distribuciones, correlaciones y relaci?n entre features y target para ambos horizontes.</w:t>
+        <w:rPr>
+          <w:lang w:val="es-419"/>
+        </w:rPr>
+      </w:pPr>
+      <w:r>
+        <w:rPr>
+          <w:lang w:val="es-419"/>
+        </w:rPr>
+        <w:t xml:space="preserve">Se generaron </w:t>
+      </w:r>
+      <w:r>
+        <w:rPr>
+          <w:lang w:val="es-419"/>
+        </w:rPr>
+        <w:t>nuevamente las seis visualizaciones correspondientes a distribuciones, correlaciones y relación</w:t>
+      </w:r>
+      <w:r>
+        <w:rPr>
+          <w:lang w:val="es-419"/>
+        </w:rPr>
+        <w:t xml:space="preserve"> entre </w:t>
+      </w:r>
+      <w:proofErr w:type="spellStart"/>
+      <w:r>
+        <w:rPr>
+          <w:lang w:val="es-419"/>
+        </w:rPr>
+        <w:t>features</w:t>
+      </w:r>
+      <w:proofErr w:type="spellEnd"/>
+      <w:r>
+        <w:rPr>
+          <w:lang w:val="es-419"/>
+        </w:rPr>
+        <w:t xml:space="preserve"> y target para ambos horizontes.</w:t>
+      </w:r>
+    </w:p>
+    <w:p>
+      <w:pPr>
+        <w:pStyle w:val="ListBullet"/>
+        <w:numPr>
+          <w:ilvl w:val="0"/>
+          <w:numId w:val="0"/>
+        </w:numPr>
+        <w:ind w:left="360" w:hanging="360"/>
+        <w:rPr>
+          <w:lang w:val="es-419"/>
+        </w:rPr>
+      </w:pPr>
+    </w:p>
+    <w:p>
+      <w:pPr>
+        <w:pStyle w:val="ListBullet"/>
+        <w:numPr>
+          <w:ilvl w:val="0"/>
+          <w:numId w:val="0"/>
+        </w:numPr>
+        <w:ind w:left="360" w:hanging="360"/>
+        <w:rPr>
+          <w:lang w:val="es-419"/>
+        </w:rPr>
+      </w:pPr>
+    </w:p>
+    <w:p>
+      <w:pPr>
+        <w:pStyle w:val="ListBullet"/>
+        <w:numPr>
+          <w:ilvl w:val="0"/>
+          <w:numId w:val="0"/>
+        </w:numPr>
+        <w:ind w:left="360" w:hanging="360"/>
+        <w:rPr>
+          <w:lang w:val="es-419"/>
+        </w:rPr>
+      </w:pPr>
+    </w:p>
+    <w:p>
+      <w:pPr>
+        <w:pStyle w:val="ListBullet"/>
+        <w:numPr>
+          <w:ilvl w:val="0"/>
+          <w:numId w:val="0"/>
+        </w:numPr>
+        <w:ind w:left="360" w:hanging="360"/>
+        <w:rPr>
+          <w:lang w:val="es-419"/>
+        </w:rPr>
+      </w:pPr>
+    </w:p>
+    <w:p>
+      <w:pPr>
+        <w:pStyle w:val="ListBullet"/>
+        <w:numPr>
+          <w:ilvl w:val="0"/>
+          <w:numId w:val="0"/>
+        </w:numPr>
+        <w:ind w:left="360" w:hanging="360"/>
+        <w:rPr>
+          <w:lang w:val="es-419"/>
+        </w:rPr>
+      </w:pPr>
+    </w:p>
+    <w:p>
+      <w:pPr>
+        <w:pStyle w:val="ListBullet"/>
+        <w:numPr>
+          <w:ilvl w:val="0"/>
+          <w:numId w:val="0"/>
+        </w:numPr>
+        <w:ind w:left="360"/>
+        <w:rPr>
+          <w:b/>
+          <w:bCs/>
+          <w:sz w:val="22"/>
+          <w:lang w:val="es-419"/>
+        </w:rPr>
+      </w:pPr>
+      <w:r>
+        <w:rPr>
+          <w:b/>
+          <w:bCs/>
+          <w:sz w:val="22"/>
+          <w:lang w:val="es-419"/>
+        </w:rPr>
+        <w:lastRenderedPageBreak/>
+        <w:t>Después de la última actualización del Word, quedaron sin documentar estos cambios:</w:t>
+      </w:r>
+    </w:p>
+    <w:p>
+      <w:pPr>
+        <w:pStyle w:val="ListBullet"/>
+        <w:numPr>
+          <w:ilvl w:val="0"/>
+          <w:numId w:val="0"/>
+        </w:numPr>
+        <w:ind w:left="360"/>
+        <w:rPr>
+          <w:lang w:val="es-419"/>
+        </w:rPr>
+      </w:pPr>
+    </w:p>
+    <w:p>
+      <w:pPr>
+        <w:pStyle w:val="ListBullet"/>
+        <w:numPr>
+          <w:ilvl w:val="0"/>
+          <w:numId w:val="10"/>
+        </w:numPr>
+        <w:rPr>
+          <w:lang w:val="es-419"/>
+        </w:rPr>
+      </w:pPr>
+      <w:r>
+        <w:rPr>
+          <w:lang w:val="es-419"/>
+        </w:rPr>
+        <w:t xml:space="preserve">Se eliminaron </w:t>
+      </w:r>
+      <w:proofErr w:type="spellStart"/>
+      <w:r>
+        <w:rPr>
+          <w:lang w:val="es-419"/>
+        </w:rPr>
+        <w:t>latitude</w:t>
+      </w:r>
+      <w:proofErr w:type="spellEnd"/>
+      <w:r>
+        <w:rPr>
+          <w:lang w:val="es-419"/>
+        </w:rPr>
+        <w:t xml:space="preserve"> y </w:t>
+      </w:r>
+      <w:proofErr w:type="spellStart"/>
+      <w:r>
+        <w:rPr>
+          <w:lang w:val="es-419"/>
+        </w:rPr>
+        <w:t>longitude</w:t>
+      </w:r>
+      <w:proofErr w:type="spellEnd"/>
+      <w:r>
+        <w:rPr>
+          <w:lang w:val="es-419"/>
+        </w:rPr>
+        <w:t xml:space="preserve"> de las variables predictoras, aunque se mantienen para calcular distancias.</w:t>
+      </w:r>
+    </w:p>
+    <w:p>
+      <w:pPr>
+        <w:pStyle w:val="ListBullet"/>
+        <w:numPr>
+          <w:ilvl w:val="0"/>
+          <w:numId w:val="10"/>
+        </w:numPr>
+        <w:rPr>
+          <w:lang w:val="es-419"/>
+        </w:rPr>
+      </w:pPr>
+      <w:r>
+        <w:rPr>
+          <w:lang w:val="es-419"/>
+        </w:rPr>
+        <w:t xml:space="preserve">Se conservó </w:t>
+      </w:r>
+      <w:proofErr w:type="spellStart"/>
+      <w:r>
+        <w:rPr>
+          <w:lang w:val="es-419"/>
+        </w:rPr>
+        <w:t>population</w:t>
+      </w:r>
+      <w:proofErr w:type="spellEnd"/>
+      <w:r>
+        <w:rPr>
+          <w:lang w:val="es-419"/>
+        </w:rPr>
+        <w:t xml:space="preserve"> como </w:t>
+      </w:r>
+      <w:proofErr w:type="spellStart"/>
+      <w:r>
+        <w:rPr>
+          <w:lang w:val="es-419"/>
+        </w:rPr>
+        <w:t>feature</w:t>
+      </w:r>
+      <w:proofErr w:type="spellEnd"/>
+      <w:r>
+        <w:rPr>
+          <w:lang w:val="es-419"/>
+        </w:rPr>
+        <w:t xml:space="preserve"> del modelo.</w:t>
+      </w:r>
+    </w:p>
+    <w:p>
+      <w:pPr>
+        <w:pStyle w:val="ListBullet"/>
+        <w:numPr>
+          <w:ilvl w:val="0"/>
+          <w:numId w:val="10"/>
+        </w:numPr>
+        <w:rPr>
+          <w:lang w:val="es-419"/>
+        </w:rPr>
+      </w:pPr>
+      <w:proofErr w:type="spellStart"/>
+      <w:r>
+        <w:rPr>
+          <w:lang w:val="es-419"/>
+        </w:rPr>
+        <w:t>country_Australia</w:t>
+      </w:r>
+      <w:proofErr w:type="spellEnd"/>
+      <w:r>
+        <w:rPr>
+          <w:lang w:val="es-419"/>
+        </w:rPr>
+        <w:t xml:space="preserve"> quedó como </w:t>
+      </w:r>
+      <w:proofErr w:type="spellStart"/>
+      <w:r>
+        <w:rPr>
+          <w:lang w:val="es-419"/>
+        </w:rPr>
+        <w:t>dummy</w:t>
+      </w:r>
+      <w:proofErr w:type="spellEnd"/>
+      <w:r>
+        <w:rPr>
+          <w:lang w:val="es-419"/>
+        </w:rPr>
+        <w:t xml:space="preserve"> explícita.</w:t>
+      </w:r>
+    </w:p>
+    <w:p>
+      <w:pPr>
+        <w:pStyle w:val="ListBullet"/>
+        <w:numPr>
+          <w:ilvl w:val="0"/>
+          <w:numId w:val="10"/>
+        </w:numPr>
+        <w:rPr>
+          <w:lang w:val="es-419"/>
+        </w:rPr>
+      </w:pPr>
+      <w:proofErr w:type="spellStart"/>
+      <w:r>
+        <w:rPr>
+          <w:lang w:val="es-419"/>
+        </w:rPr>
+        <w:t>country_Canada</w:t>
+      </w:r>
+      <w:proofErr w:type="spellEnd"/>
+      <w:r>
+        <w:rPr>
+          <w:lang w:val="es-419"/>
+        </w:rPr>
+        <w:t xml:space="preserve"> se usa como categoría de referencia por ser el país con menos registros.</w:t>
+      </w:r>
+    </w:p>
+    <w:p>
+      <w:pPr>
+        <w:pStyle w:val="ListBullet"/>
+        <w:numPr>
+          <w:ilvl w:val="0"/>
+          <w:numId w:val="10"/>
+        </w:numPr>
+        <w:rPr>
+          <w:lang w:val="en-AU"/>
+        </w:rPr>
+      </w:pPr>
+      <w:proofErr w:type="spellStart"/>
+      <w:r>
+        <w:rPr>
+          <w:lang w:val="en-AU"/>
+        </w:rPr>
+        <w:t>drop_first</w:t>
+      </w:r>
+      <w:proofErr w:type="spellEnd"/>
+      <w:r>
+        <w:rPr>
+          <w:lang w:val="en-AU"/>
+        </w:rPr>
+        <w:t xml:space="preserve">=False se </w:t>
+      </w:r>
+      <w:proofErr w:type="spellStart"/>
+      <w:r>
+        <w:rPr>
+          <w:lang w:val="en-AU"/>
+        </w:rPr>
+        <w:t>aplicó</w:t>
+      </w:r>
+      <w:proofErr w:type="spellEnd"/>
+      <w:r>
+        <w:rPr>
+          <w:lang w:val="en-AU"/>
+        </w:rPr>
+        <w:t xml:space="preserve"> </w:t>
+      </w:r>
+      <w:proofErr w:type="spellStart"/>
+      <w:r>
+        <w:rPr>
+          <w:lang w:val="en-AU"/>
+        </w:rPr>
+        <w:t>únicamente</w:t>
+      </w:r>
+      <w:proofErr w:type="spellEnd"/>
+      <w:r>
+        <w:rPr>
+          <w:lang w:val="en-AU"/>
+        </w:rPr>
+        <w:t xml:space="preserve"> a country; </w:t>
+      </w:r>
+      <w:proofErr w:type="spellStart"/>
+      <w:r>
+        <w:rPr>
+          <w:lang w:val="en-AU"/>
+        </w:rPr>
+        <w:t>recency_segment</w:t>
+      </w:r>
+      <w:proofErr w:type="spellEnd"/>
+      <w:r>
+        <w:rPr>
+          <w:lang w:val="en-AU"/>
+        </w:rPr>
+        <w:t xml:space="preserve"> y </w:t>
+      </w:r>
+      <w:proofErr w:type="spellStart"/>
+      <w:r>
+        <w:rPr>
+          <w:lang w:val="en-AU"/>
+        </w:rPr>
+        <w:t>spending_tier</w:t>
+      </w:r>
+      <w:proofErr w:type="spellEnd"/>
+      <w:r>
+        <w:rPr>
+          <w:lang w:val="en-AU"/>
+        </w:rPr>
+        <w:t xml:space="preserve"> </w:t>
+      </w:r>
+      <w:proofErr w:type="spellStart"/>
+      <w:r>
+        <w:rPr>
+          <w:lang w:val="en-AU"/>
+        </w:rPr>
+        <w:t>mantienen</w:t>
+      </w:r>
+      <w:proofErr w:type="spellEnd"/>
+      <w:r>
+        <w:rPr>
+          <w:lang w:val="en-AU"/>
+        </w:rPr>
+        <w:t xml:space="preserve"> </w:t>
+      </w:r>
+      <w:proofErr w:type="spellStart"/>
+      <w:r>
+        <w:rPr>
+          <w:lang w:val="en-AU"/>
+        </w:rPr>
+        <w:t>drop_first</w:t>
+      </w:r>
+      <w:proofErr w:type="spellEnd"/>
+      <w:r>
+        <w:rPr>
+          <w:lang w:val="en-AU"/>
+        </w:rPr>
+        <w:t>=True.</w:t>
+      </w:r>
+    </w:p>
+    <w:p>
+      <w:pPr>
+        <w:pStyle w:val="ListBullet"/>
+        <w:numPr>
+          <w:ilvl w:val="0"/>
+          <w:numId w:val="10"/>
+        </w:numPr>
+        <w:rPr>
+          <w:lang w:val="es-419"/>
+        </w:rPr>
+      </w:pPr>
+      <w:r>
+        <w:rPr>
+          <w:lang w:val="es-419"/>
+        </w:rPr>
+        <w:t xml:space="preserve">Se eliminó la generación de las matrices full; ahora solo se producen las matrices </w:t>
+      </w:r>
+      <w:proofErr w:type="spellStart"/>
+      <w:r>
+        <w:rPr>
+          <w:lang w:val="es-419"/>
+        </w:rPr>
+        <w:t>focus</w:t>
+      </w:r>
+      <w:proofErr w:type="spellEnd"/>
+      <w:r>
+        <w:rPr>
+          <w:lang w:val="es-419"/>
+        </w:rPr>
+        <w:t>.</w:t>
+      </w:r>
+    </w:p>
+    <w:p>
+      <w:pPr>
+        <w:pStyle w:val="ListBullet"/>
+        <w:numPr>
+          <w:ilvl w:val="0"/>
+          <w:numId w:val="10"/>
+        </w:numPr>
+        <w:rPr>
+          <w:lang w:val="en-AU"/>
+        </w:rPr>
+      </w:pPr>
+      <w:r>
+        <w:rPr>
+          <w:lang w:val="en-AU"/>
+        </w:rPr>
+        <w:t xml:space="preserve">Se </w:t>
+      </w:r>
+      <w:proofErr w:type="spellStart"/>
+      <w:r>
+        <w:rPr>
+          <w:lang w:val="en-AU"/>
+        </w:rPr>
+        <w:t>agregaron</w:t>
+      </w:r>
+      <w:proofErr w:type="spellEnd"/>
+      <w:r>
+        <w:rPr>
+          <w:lang w:val="en-AU"/>
+        </w:rPr>
+        <w:t xml:space="preserve"> </w:t>
+      </w:r>
+      <w:proofErr w:type="spellStart"/>
+      <w:r>
+        <w:rPr>
+          <w:lang w:val="en-AU"/>
+        </w:rPr>
+        <w:t>los</w:t>
+      </w:r>
+      <w:proofErr w:type="spellEnd"/>
+      <w:r>
+        <w:rPr>
+          <w:lang w:val="en-AU"/>
+        </w:rPr>
+        <w:t xml:space="preserve"> </w:t>
+      </w:r>
+      <w:proofErr w:type="spellStart"/>
+      <w:r>
+        <w:rPr>
+          <w:lang w:val="en-AU"/>
+        </w:rPr>
+        <w:t>gráficos</w:t>
+      </w:r>
+      <w:proofErr w:type="spellEnd"/>
+      <w:r>
+        <w:rPr>
+          <w:lang w:val="en-AU"/>
+        </w:rPr>
+        <w:t>:</w:t>
+      </w:r>
+    </w:p>
+    <w:p>
+      <w:pPr>
+        <w:pStyle w:val="ListBullet"/>
+        <w:numPr>
+          <w:ilvl w:val="1"/>
+          <w:numId w:val="10"/>
+        </w:numPr>
+        <w:rPr>
+          <w:lang w:val="en-AU"/>
+        </w:rPr>
+      </w:pPr>
+      <w:r>
+        <w:rPr>
+          <w:lang w:val="en-AU"/>
+        </w:rPr>
+        <w:t>population_distribution.png;</w:t>
+      </w:r>
+    </w:p>
+    <w:p>
+      <w:pPr>
+        <w:pStyle w:val="ListBullet"/>
+        <w:numPr>
+          <w:ilvl w:val="1"/>
+          <w:numId w:val="10"/>
+        </w:numPr>
+        <w:rPr>
+          <w:lang w:val="en-AU"/>
+        </w:rPr>
+      </w:pPr>
+      <w:r>
+        <w:rPr>
+          <w:lang w:val="en-AU"/>
+        </w:rPr>
+        <w:t>distance_to_major_city_distribution.png.</w:t>
+      </w:r>
+    </w:p>
+    <w:p>
+      <w:pPr>
+        <w:pStyle w:val="ListBullet"/>
+        <w:numPr>
+          <w:ilvl w:val="0"/>
+          <w:numId w:val="10"/>
+        </w:numPr>
+        <w:rPr>
+          <w:lang w:val="es-419"/>
+        </w:rPr>
+      </w:pPr>
+      <w:r>
+        <w:rPr>
+          <w:lang w:val="es-419"/>
+        </w:rPr>
+        <w:t>Las distancias desconocidas dejaron de imputarse con la mediana.</w:t>
+      </w:r>
+    </w:p>
+    <w:p>
+      <w:pPr>
+        <w:pStyle w:val="ListBullet"/>
+        <w:numPr>
+          <w:ilvl w:val="0"/>
+          <w:numId w:val="10"/>
+        </w:numPr>
+        <w:rPr>
+          <w:lang w:val="es-419"/>
+        </w:rPr>
+      </w:pPr>
+      <w:r>
+        <w:rPr>
+          <w:lang w:val="es-419"/>
+        </w:rPr>
+        <w:t>Las distancias no disponibles ahora se representan como -1.</w:t>
+      </w:r>
+    </w:p>
+    <w:p>
+      <w:pPr>
+        <w:pStyle w:val="ListBullet"/>
+        <w:numPr>
+          <w:ilvl w:val="0"/>
+          <w:numId w:val="10"/>
+        </w:numPr>
+        <w:rPr>
+          <w:lang w:val="es-419"/>
+        </w:rPr>
+      </w:pPr>
+      <w:proofErr w:type="spellStart"/>
+      <w:r>
+        <w:rPr>
+          <w:lang w:val="es-419"/>
+        </w:rPr>
+        <w:t>has_geographic_match</w:t>
+      </w:r>
+      <w:proofErr w:type="spellEnd"/>
+      <w:r>
+        <w:rPr>
+          <w:lang w:val="es-419"/>
+        </w:rPr>
+        <w:t xml:space="preserve"> identifica si la distancia es real o desconocida.</w:t>
+      </w:r>
+    </w:p>
+    <w:p>
+      <w:pPr>
+        <w:pStyle w:val="ListBullet"/>
+        <w:numPr>
+          <w:ilvl w:val="0"/>
+          <w:numId w:val="10"/>
+        </w:numPr>
+        <w:rPr>
+          <w:lang w:val="es-419"/>
+        </w:rPr>
+      </w:pPr>
+      <w:r>
+        <w:rPr>
+          <w:lang w:val="es-419"/>
+        </w:rPr>
+        <w:t>La EDA excluye las distancias -1 de histogramas y rangos.</w:t>
+      </w:r>
+    </w:p>
+    <w:p>
+      <w:pPr>
+        <w:pStyle w:val="ListBullet"/>
+        <w:numPr>
+          <w:ilvl w:val="0"/>
+          <w:numId w:val="10"/>
+        </w:numPr>
+        <w:rPr>
+          <w:lang w:val="es-419"/>
+        </w:rPr>
+      </w:pPr>
+      <w:r>
+        <w:rPr>
+          <w:lang w:val="es-419"/>
+        </w:rPr>
+        <w:t>Se actualizó nuevamente el pipeline completo después de estos cambios.</w:t>
+      </w:r>
+    </w:p>
+    <w:p>
+      <w:pPr>
+        <w:pStyle w:val="ListBullet"/>
+        <w:numPr>
+          <w:ilvl w:val="0"/>
+          <w:numId w:val="10"/>
+        </w:numPr>
+        <w:rPr>
+          <w:lang w:val="es-419"/>
+        </w:rPr>
+      </w:pPr>
+      <w:r>
+        <w:rPr>
+          <w:lang w:val="es-419"/>
+        </w:rPr>
+        <w:t xml:space="preserve">Se regeneraron los rankings de </w:t>
+      </w:r>
+      <w:proofErr w:type="spellStart"/>
+      <w:r>
+        <w:rPr>
+          <w:lang w:val="es-419"/>
+        </w:rPr>
+        <w:t>model</w:t>
+      </w:r>
+      <w:proofErr w:type="spellEnd"/>
+      <w:r>
+        <w:rPr>
+          <w:lang w:val="es-419"/>
+        </w:rPr>
+        <w:t xml:space="preserve"> </w:t>
+      </w:r>
+      <w:proofErr w:type="spellStart"/>
+      <w:r>
+        <w:rPr>
+          <w:lang w:val="es-419"/>
+        </w:rPr>
+        <w:t>selection</w:t>
+      </w:r>
+      <w:proofErr w:type="spellEnd"/>
+      <w:r>
+        <w:rPr>
+          <w:lang w:val="es-419"/>
+        </w:rPr>
+        <w:t>.</w:t>
+      </w:r>
+    </w:p>
+    <w:p>
+      <w:pPr>
+        <w:pStyle w:val="ListBullet"/>
+        <w:numPr>
+          <w:ilvl w:val="0"/>
+          <w:numId w:val="10"/>
+        </w:numPr>
+        <w:rPr>
+          <w:lang w:val="es-419"/>
+        </w:rPr>
+      </w:pPr>
+      <w:r>
+        <w:rPr>
+          <w:lang w:val="es-419"/>
+        </w:rPr>
+        <w:t xml:space="preserve">Se realizó el </w:t>
+      </w:r>
+      <w:proofErr w:type="spellStart"/>
+      <w:r>
+        <w:rPr>
+          <w:lang w:val="es-419"/>
+        </w:rPr>
+        <w:t>commit</w:t>
+      </w:r>
+      <w:proofErr w:type="spellEnd"/>
+      <w:r>
+        <w:rPr>
+          <w:lang w:val="es-419"/>
+        </w:rPr>
+        <w:t xml:space="preserve"> y </w:t>
+      </w:r>
+      <w:proofErr w:type="spellStart"/>
+      <w:r>
+        <w:rPr>
+          <w:lang w:val="es-419"/>
+        </w:rPr>
+        <w:t>push</w:t>
+      </w:r>
+      <w:proofErr w:type="spellEnd"/>
+      <w:r>
+        <w:rPr>
+          <w:lang w:val="es-419"/>
+        </w:rPr>
+        <w:t xml:space="preserve"> final a GitHub:</w:t>
+      </w:r>
+    </w:p>
+    <w:p>
+      <w:pPr>
+        <w:pStyle w:val="ListBullet"/>
+        <w:numPr>
+          <w:ilvl w:val="1"/>
+          <w:numId w:val="10"/>
+        </w:numPr>
+        <w:rPr>
+          <w:lang w:val="en-AU"/>
+        </w:rPr>
+      </w:pPr>
+      <w:r>
+        <w:rPr>
+          <w:lang w:val="en-AU"/>
+        </w:rPr>
+        <w:t>8f2c9e0 Update geographic features and EDA pipeline.</w:t>
+      </w:r>
+    </w:p>
+    <w:p>
+      <w:pPr>
+        <w:pStyle w:val="ListBullet"/>
+        <w:numPr>
+          <w:ilvl w:val="0"/>
+          <w:numId w:val="0"/>
+        </w:numPr>
+        <w:ind w:left="360" w:hanging="360"/>
+        <w:rPr>
+          <w:lang w:val="en-AU"/>
+        </w:rPr>
+      </w:pPr>
+    </w:p>
+    <w:p>
+      <w:r>
+        <w:br w:type="page"/>
+      </w:r>
+    </w:p>
+    <w:p>
+      <w:pPr>
+        <w:pStyle w:val="Title"/>
+      </w:pPr>
+      <w:r>
+        <w:t>Cambios del 18/09/2026 al 22/09/2026</w:t>
+      </w:r>
+    </w:p>
+    <w:p>
+      <w:r>
+        <w:rPr>
+          <w:i/>
+        </w:rPr>
+        <w:t>Actualizaci?n del pipeline posterior a la ?ltima versi?n del documento.</w:t>
+      </w:r>
+    </w:p>
+    <w:p>
+      <w:pPr>
+        <w:pStyle w:val="Heading1"/>
+      </w:pPr>
+      <w:r>
+        <w:t>Validaci?n geogr?fica en preprocessing</w:t>
+      </w:r>
+    </w:p>
+    <w:p>
+      <w:pPr>
+        <w:pStyle w:val="ListBullet"/>
+      </w:pPr>
+      <w:r>
+        <w:t>Se agreg? una validaci?n centralizada de las columnas geogr?ficas obligatorias: city, country, population, latitude y longitude.</w:t>
+      </w:r>
+    </w:p>
+    <w:p>
+      <w:pPr>
+        <w:pStyle w:val="ListBullet"/>
+      </w:pPr>
+      <w:r>
+        <w:t>El pipeline ahora falla expl?citamente si falta alguna de estas columnas, en lugar de continuar silenciosamente.</w:t>
+      </w:r>
+    </w:p>
+    <w:p>
+      <w:pPr>
+        <w:pStyle w:val="ListBullet"/>
+      </w:pPr>
+      <w:r>
+        <w:t>Los valores faltantes de poblaci?n se identifican mediante population_missing.</w:t>
+      </w:r>
+    </w:p>
+    <w:p>
+      <w:pPr>
+        <w:pStyle w:val="ListBullet"/>
+      </w:pPr>
+      <w:r>
+        <w:t>La poblaci?n se imputa con la mediana ?nicamente para compatibilidad con los modelos; el indicador conserva la informaci?n de ausencia original.</w:t>
+      </w:r>
+    </w:p>
+    <w:p>
+      <w:pPr>
+        <w:pStyle w:val="ListBullet"/>
+      </w:pPr>
+      <w:r>
+        <w:t>Las ciudades y pa?ses inv?lidos o faltantes se normalizan como Unknown, evitando mezclar Unknown con Other.</w:t>
+      </w:r>
+    </w:p>
+    <w:p>
+      <w:pPr>
+        <w:pStyle w:val="Heading1"/>
+      </w:pPr>
+      <w:r>
+        <w:t>Model selection y training</w:t>
+      </w:r>
+    </w:p>
+    <w:p>
+      <w:pPr>
+        <w:pStyle w:val="ListBullet"/>
+      </w:pPr>
+      <w:r>
+        <w:t>Se elimin? la funci?n select_best_model porque no era utilizada por el flujo real.</w:t>
+      </w:r>
+    </w:p>
+    <w:p>
+      <w:pPr>
+        <w:pStyle w:val="ListBullet"/>
+      </w:pPr>
+      <w:r>
+        <w:t>Se elimin? el fallback silencioso a Random Forest cuando el nombre del modelo no coincide; ahora se genera un error expl?cito.</w:t>
+      </w:r>
+    </w:p>
+    <w:p>
+      <w:pPr>
+        <w:pStyle w:val="ListBullet"/>
+      </w:pPr>
+      <w:r>
+        <w:t>Se incorpor? StandardScaler dentro de Pipeline para Logistic Regression, SVM y KNN.</w:t>
+      </w:r>
+    </w:p>
+    <w:p>
+      <w:pPr>
+        <w:pStyle w:val="ListBullet"/>
+      </w:pPr>
+      <w:r>
+        <w:t>Los modelos basados en ?rboles no utilizan scaling.</w:t>
+      </w:r>
+    </w:p>
+    <w:p>
+      <w:pPr>
+        <w:pStyle w:val="ListBullet"/>
+      </w:pPr>
+      <w:r>
+        <w:t>Se elimin? el par?metro obsoleto use_label_encoder de XGBoost.</w:t>
+      </w:r>
+    </w:p>
+    <w:p>
+      <w:pPr>
+        <w:pStyle w:val="ListBullet"/>
+      </w:pPr>
+      <w:r>
+        <w:t>El modelo seleccionado para el horizonte de seis meses qued? correctamente identificado como XGBoost.</w:t>
+      </w:r>
+    </w:p>
+    <w:p>
+      <w:pPr>
+        <w:pStyle w:val="ListBullet"/>
+      </w:pPr>
+      <w:r>
+        <w:t>El entrenamiento final utiliza el modelo ganador guardado en best_model_name.pkl y GridSearchCV busca sus mejores hiperpar?metros.</w:t>
+      </w:r>
+    </w:p>
+    <w:p>
+      <w:pPr>
+        <w:pStyle w:val="Heading1"/>
+      </w:pPr>
+      <w:r>
+        <w:t>Evaluaci?n final</w:t>
+      </w:r>
+    </w:p>
+    <w:p>
+      <w:pPr>
+        <w:pStyle w:val="ListBullet"/>
+      </w:pPr>
+      <w:r>
+        <w:t>07_evaluation.py se ejecut? correctamente sobre el modelo XGBoost entrenado.</w:t>
+      </w:r>
+    </w:p>
+    <w:p>
+      <w:pPr>
+        <w:pStyle w:val="ListBullet"/>
+      </w:pPr>
+      <w:r>
+        <w:t>Accuracy: 0.9011.</w:t>
+      </w:r>
+    </w:p>
+    <w:p>
+      <w:pPr>
+        <w:pStyle w:val="ListBullet"/>
+      </w:pPr>
+      <w:r>
+        <w:t>Precision: 0.8893.</w:t>
+      </w:r>
+    </w:p>
+    <w:p>
+      <w:pPr>
+        <w:pStyle w:val="ListBullet"/>
+      </w:pPr>
+      <w:r>
+        <w:t>Recall: 0.8071.</w:t>
+      </w:r>
+    </w:p>
+    <w:p>
+      <w:pPr>
+        <w:pStyle w:val="ListBullet"/>
+      </w:pPr>
+      <w:r>
+        <w:t>F1-score: 0.8462.</w:t>
+      </w:r>
+    </w:p>
+    <w:p>
+      <w:pPr>
+        <w:pStyle w:val="ListBullet"/>
+      </w:pPr>
+      <w:r>
+        <w:t>La matriz de confusi?n fue [[1634, 88], [169, 707]].</w:t>
+      </w:r>
+    </w:p>
+    <w:p>
+      <w:pPr>
+        <w:pStyle w:val="ListBullet"/>
+      </w:pPr>
+      <w:r>
+        <w:t>Se generaron confusion_matrix.png, roc_curve.png, precision_recall_curve.png y feature_importance.png.</w:t>
+      </w:r>
+    </w:p>
+    <w:p>
+      <w:pPr>
+        <w:pStyle w:val="ListBullet"/>
+      </w:pPr>
+      <w:r>
+        <w:t>No se registraron warnings ni errores en la evaluaci?n final.</w:t>
+      </w:r>
+    </w:p>
+    <w:p>
+      <w:pPr>
+        <w:pStyle w:val="Heading1"/>
+      </w:pPr>
+      <w:r>
+        <w:t>Predicci?n para nuevos clientes</w:t>
+      </w:r>
+    </w:p>
+    <w:p>
+      <w:pPr>
+        <w:pStyle w:val="ListBullet"/>
+      </w:pPr>
+      <w:r>
+        <w:t>Se cre? predict_new_customer.py para estimar la probabilidad de recompra de un cliente individual.</w:t>
+      </w:r>
+    </w:p>
+    <w:p>
+      <w:pPr>
+        <w:pStyle w:val="ListBullet"/>
+      </w:pPr>
+      <w:r>
+        <w:t>El predictor recibe las 43 features utilizadas durante el entrenamiento.</w:t>
+      </w:r>
+    </w:p>
+    <w:p>
+      <w:pPr>
+        <w:pStyle w:val="ListBullet"/>
+      </w:pPr>
+      <w:r>
+        <w:t>Se valida que no falten ni sobren columnas y se respeta el orden almacenado en feature_columns.pkl.</w:t>
+      </w:r>
+    </w:p>
+    <w:p>
+      <w:pPr>
+        <w:pStyle w:val="ListBullet"/>
+      </w:pPr>
+      <w:r>
+        <w:t>El resultado incluye la probabilidad de recompra a seis meses, la probabilidad de no recompra y la predicci?n binaria.</w:t>
+      </w:r>
+    </w:p>
+    <w:p>
+      <w:pPr>
+        <w:pStyle w:val="ListBullet"/>
+      </w:pPr>
+      <w:r>
+        <w:t>El modelo utilizado se carga desde models/trained_model.pkl.</w:t>
+      </w:r>
+    </w:p>
+    <w:p>
+      <w:pPr>
+        <w:pStyle w:val="ListBullet"/>
+      </w:pPr>
+      <w:r>
+        <w:t>El predictor fue probado con un registro real de engineered_features.csv y devolvi? una probabilidad v?lida entre 0 y 1.</w:t>
       </w:r>
     </w:p>
     <w:sectPr>
@@ -5506,6 +7088,155 @@
       </w:pPr>
       <w:rPr>
         <w:rFonts w:ascii="Symbol" w:hAnsi="Symbol" w:hint="default"/>
+      </w:rPr>
+    </w:lvl>
+  </w:abstractNum>
+  <w:abstractNum w:abstractNumId="9" w15:restartNumberingAfterBreak="0">
+    <w:nsid w:val="66B04B2C"/>
+    <w:multiLevelType w:val="multilevel"/>
+    <w:tmpl w:val="3D4E6ADE"/>
+    <w:lvl w:ilvl="0">
+      <w:start w:val="1"/>
+      <w:numFmt w:val="bullet"/>
+      <w:lvlText w:val=""/>
+      <w:lvlJc w:val="left"/>
+      <w:pPr>
+        <w:tabs>
+          <w:tab w:val="num" w:pos="720"/>
+        </w:tabs>
+        <w:ind w:left="720" w:hanging="360"/>
+      </w:pPr>
+      <w:rPr>
+        <w:rFonts w:ascii="Symbol" w:hAnsi="Symbol" w:hint="default"/>
+        <w:sz w:val="20"/>
+      </w:rPr>
+    </w:lvl>
+    <w:lvl w:ilvl="1">
+      <w:start w:val="1"/>
+      <w:numFmt w:val="bullet"/>
+      <w:lvlText w:val="o"/>
+      <w:lvlJc w:val="left"/>
+      <w:pPr>
+        <w:tabs>
+          <w:tab w:val="num" w:pos="1440"/>
+        </w:tabs>
+        <w:ind w:left="1440" w:hanging="360"/>
+      </w:pPr>
+      <w:rPr>
+        <w:rFonts w:ascii="Courier New" w:hAnsi="Courier New" w:hint="default"/>
+        <w:sz w:val="20"/>
+      </w:rPr>
+    </w:lvl>
+    <w:lvl w:ilvl="2" w:tentative="1">
+      <w:start w:val="1"/>
+      <w:numFmt w:val="bullet"/>
+      <w:lvlText w:val=""/>
+      <w:lvlJc w:val="left"/>
+      <w:pPr>
+        <w:tabs>
+          <w:tab w:val="num" w:pos="2160"/>
+        </w:tabs>
+        <w:ind w:left="2160" w:hanging="360"/>
+      </w:pPr>
+      <w:rPr>
+        <w:rFonts w:ascii="Wingdings" w:hAnsi="Wingdings" w:hint="default"/>
+        <w:sz w:val="20"/>
+      </w:rPr>
+    </w:lvl>
+    <w:lvl w:ilvl="3" w:tentative="1">
+      <w:start w:val="1"/>
+      <w:numFmt w:val="bullet"/>
+      <w:lvlText w:val=""/>
+      <w:lvlJc w:val="left"/>
+      <w:pPr>
+        <w:tabs>
+          <w:tab w:val="num" w:pos="2880"/>
+        </w:tabs>
+        <w:ind w:left="2880" w:hanging="360"/>
+      </w:pPr>
+      <w:rPr>
+        <w:rFonts w:ascii="Wingdings" w:hAnsi="Wingdings" w:hint="default"/>
+        <w:sz w:val="20"/>
+      </w:rPr>
+    </w:lvl>
+    <w:lvl w:ilvl="4" w:tentative="1">
+      <w:start w:val="1"/>
+      <w:numFmt w:val="bullet"/>
+      <w:lvlText w:val=""/>
+      <w:lvlJc w:val="left"/>
+      <w:pPr>
+        <w:tabs>
+          <w:tab w:val="num" w:pos="3600"/>
+        </w:tabs>
+        <w:ind w:left="3600" w:hanging="360"/>
+      </w:pPr>
+      <w:rPr>
+        <w:rFonts w:ascii="Wingdings" w:hAnsi="Wingdings" w:hint="default"/>
+        <w:sz w:val="20"/>
+      </w:rPr>
+    </w:lvl>
+    <w:lvl w:ilvl="5" w:tentative="1">
+      <w:start w:val="1"/>
+      <w:numFmt w:val="bullet"/>
+      <w:lvlText w:val=""/>
+      <w:lvlJc w:val="left"/>
+      <w:pPr>
+        <w:tabs>
+          <w:tab w:val="num" w:pos="4320"/>
+        </w:tabs>
+        <w:ind w:left="4320" w:hanging="360"/>
+      </w:pPr>
+      <w:rPr>
+        <w:rFonts w:ascii="Wingdings" w:hAnsi="Wingdings" w:hint="default"/>
+        <w:sz w:val="20"/>
+      </w:rPr>
+    </w:lvl>
+    <w:lvl w:ilvl="6" w:tentative="1">
+      <w:start w:val="1"/>
+      <w:numFmt w:val="bullet"/>
+      <w:lvlText w:val=""/>
+      <w:lvlJc w:val="left"/>
+      <w:pPr>
+        <w:tabs>
+          <w:tab w:val="num" w:pos="5040"/>
+        </w:tabs>
+        <w:ind w:left="5040" w:hanging="360"/>
+      </w:pPr>
+      <w:rPr>
+        <w:rFonts w:ascii="Wingdings" w:hAnsi="Wingdings" w:hint="default"/>
+        <w:sz w:val="20"/>
+      </w:rPr>
+    </w:lvl>
+    <w:lvl w:ilvl="7" w:tentative="1">
+      <w:start w:val="1"/>
+      <w:numFmt w:val="bullet"/>
+      <w:lvlText w:val=""/>
+      <w:lvlJc w:val="left"/>
+      <w:pPr>
+        <w:tabs>
+          <w:tab w:val="num" w:pos="5760"/>
+        </w:tabs>
+        <w:ind w:left="5760" w:hanging="360"/>
+      </w:pPr>
+      <w:rPr>
+        <w:rFonts w:ascii="Wingdings" w:hAnsi="Wingdings" w:hint="default"/>
+        <w:sz w:val="20"/>
+      </w:rPr>
+    </w:lvl>
+    <w:lvl w:ilvl="8" w:tentative="1">
+      <w:start w:val="1"/>
+      <w:numFmt w:val="bullet"/>
+      <w:lvlText w:val=""/>
+      <w:lvlJc w:val="left"/>
+      <w:pPr>
+        <w:tabs>
+          <w:tab w:val="num" w:pos="6480"/>
+        </w:tabs>
+        <w:ind w:left="6480" w:hanging="360"/>
+      </w:pPr>
+      <w:rPr>
+        <w:rFonts w:ascii="Wingdings" w:hAnsi="Wingdings" w:hint="default"/>
+        <w:sz w:val="20"/>
       </w:rPr>
     </w:lvl>
   </w:abstractNum>
@@ -5535,6 +7266,9 @@
   </w:num>
   <w:num w:numId="9" w16cid:durableId="1521817986">
     <w:abstractNumId w:val="0"/>
+  </w:num>
+  <w:num w:numId="10" w16cid:durableId="286544822">
+    <w:abstractNumId w:val="9"/>
   </w:num>
 </w:numbering>
 </file>
@@ -6144,7 +7878,6 @@
   <w:style w:type="character" w:default="1" w:styleId="DefaultParagraphFont">
     <w:name w:val="Default Paragraph Font"/>
     <w:uiPriority w:val="1"/>
-    <w:semiHidden/>
     <w:unhideWhenUsed/>
   </w:style>
   <w:style w:type="table" w:default="1" w:styleId="TableNormal">

</xml_diff>